<commit_message>
SE-Template: Fix spaces between texts and dataset tables
</commit_message>
<xml_diff>
--- a/src/main/resources/org/damap/base/template/scienceEuropeTemplate.docx
+++ b/src/main/resources/org/damap/base/template/scienceEuropeTemplate.docx
@@ -1155,7 +1155,7 @@
                     </wp:anchor>
                   </w:drawing>
                 </mc:Choice>
-                <mc:Fallback xmlns:pic="http://schemas.openxmlformats.org/drawingml/2006/picture" xmlns:wp14="http://schemas.microsoft.com/office/word/2010/wordml" xmlns:a="http://schemas.openxmlformats.org/drawingml/2006/main">
+                <mc:Fallback xmlns:a="http://schemas.openxmlformats.org/drawingml/2006/main" xmlns:wp14="http://schemas.microsoft.com/office/word/2010/wordml" xmlns:pic="http://schemas.openxmlformats.org/drawingml/2006/picture">
                   <w:pict w14:anchorId="0091B2AA">
                     <v:shapetype coordsize="21600,21600" o:spt="75" o:preferrelative="t" path="m@4@5l@4@11@9@11@9@5xe" type="#_x0000_t75">
                       <v:formulas>
@@ -4391,13 +4391,6 @@
         <w:t>The following datasets will be produced:</w:t>
       </w:r>
     </w:p>
-    <w:p>
-      <w:pPr>
-        <w:rPr>
-          <w:lang w:val="en-GB"/>
-        </w:rPr>
-      </w:pPr>
-    </w:p>
     <w:tbl>
       <w:tblPr>
         <w:tblStyle w:val="GridTableLight0"/>
@@ -5553,15 +5546,6 @@
       <w:pPr>
         <w:rPr>
           <w:rFonts w:asciiTheme="minorHAnsi" w:hAnsiTheme="minorHAnsi" w:cstheme="minorHAnsi"/>
-          <w:lang w:val="en-GB"/>
-        </w:rPr>
-      </w:pPr>
-      <w:bookmarkStart w:id="9" w:name="_Toc109653443"/>
-    </w:p>
-    <w:p>
-      <w:pPr>
-        <w:rPr>
-          <w:rFonts w:asciiTheme="minorHAnsi" w:hAnsiTheme="minorHAnsi" w:cstheme="minorHAnsi"/>
           <w:b/>
           <w:bCs/>
           <w:i/>
@@ -5569,6 +5553,7 @@
           <w:lang w:val="en-US"/>
         </w:rPr>
       </w:pPr>
+      <w:bookmarkStart w:id="9" w:name="_Toc109653443"/>
       <w:r>
         <w:rPr>
           <w:rFonts w:asciiTheme="minorHAnsi" w:hAnsiTheme="minorHAnsi" w:cstheme="minorHAnsi"/>
@@ -26332,7 +26317,9 @@
 </file>
 
 <file path=customXml/item1.xml><?xml version="1.0" encoding="utf-8"?>
-<b:Sources xmlns:b="http://schemas.openxmlformats.org/officeDocument/2006/bibliography" xmlns="http://schemas.openxmlformats.org/officeDocument/2006/bibliography" SelectedStyle="\APASixthEditionOfficeOnline.xsl" StyleName="APA" Version="6"/>
+<w:settings xmlns:w="http://schemas.openxmlformats.org/wordprocessingml/2006/main">
+  <w:SpecialFormsHighlight w:val="c9c8ff"/>
+</w:settings>
 </file>
 
 <file path=customXml/item2.xml><?xml version="1.0" encoding="utf-8"?>
@@ -26342,15 +26329,13 @@
 </file>
 
 <file path=customXml/item3.xml><?xml version="1.0" encoding="utf-8"?>
-<w:settings xmlns:w="http://schemas.openxmlformats.org/wordprocessingml/2006/main">
-  <w:SpecialFormsHighlight w:val="c9c8ff"/>
-</w:settings>
+<b:Sources xmlns:b="http://schemas.openxmlformats.org/officeDocument/2006/bibliography" xmlns="http://schemas.openxmlformats.org/officeDocument/2006/bibliography" SelectedStyle="\APASixthEditionOfficeOnline.xsl" StyleName="APA" Version="6"/>
 </file>
 
 <file path=customXml/itemProps1.xml><?xml version="1.0" encoding="utf-8"?>
-<ds:datastoreItem xmlns:ds="http://schemas.openxmlformats.org/officeDocument/2006/customXml" ds:itemID="{D87E246E-8484-4253-908C-7604FEB470CE}">
+<ds:datastoreItem xmlns:ds="http://schemas.openxmlformats.org/officeDocument/2006/customXml" ds:itemID="{5D0AEA6B-E499-4EEF-98A3-AFBB261C493E}">
   <ds:schemaRefs>
-    <ds:schemaRef ds:uri="http://schemas.openxmlformats.org/officeDocument/2006/bibliography"/>
+    <ds:schemaRef ds:uri="http://schemas.openxmlformats.org/wordprocessingml/2006/main"/>
   </ds:schemaRefs>
 </ds:datastoreItem>
 </file>
@@ -26365,9 +26350,9 @@
 </file>
 
 <file path=customXml/itemProps3.xml><?xml version="1.0" encoding="utf-8"?>
-<ds:datastoreItem xmlns:ds="http://schemas.openxmlformats.org/officeDocument/2006/customXml" ds:itemID="{5D0AEA6B-E499-4EEF-98A3-AFBB261C493E}">
+<ds:datastoreItem xmlns:ds="http://schemas.openxmlformats.org/officeDocument/2006/customXml" ds:itemID="{D87E246E-8484-4253-908C-7604FEB470CE}">
   <ds:schemaRefs>
-    <ds:schemaRef ds:uri="http://schemas.openxmlformats.org/wordprocessingml/2006/main"/>
+    <ds:schemaRef ds:uri="http://schemas.openxmlformats.org/officeDocument/2006/bibliography"/>
   </ds:schemaRefs>
 </ds:datastoreItem>
 </file>
</xml_diff>